<commit_message>
chore(adapter): pre-Phase-5.6 checkpoint — all adapter features working
SAFE ROLLBACK POINT before Prescriptive KB (Phase 5.6) changes.

Working state includes:
- Phase 5.1-5.5 complete (analysis preview, interactive mapping,
  placeholder verification, intelligent KB, LLM regeneration)
- Template adapter end-to-end: upload → auto-map → verify → preview → download
- KB with 126 entries, confidence tracking, blueprints, style hints
- Mapping table with inline editing, delete, add, regenerate
- PDF viewer with bidirectional table sync
- All document locations: body, headers, footers, text boxes, tables

Planning artifacts: Phase 5.6 (Prescriptive KB) discussed and scoped.

Co-Authored-By: Claude Opus 4.6 <noreply@anthropic.com>
</commit_message>
<xml_diff>
--- a/test-templates/ghost-templates/Web_-_EN_2025_-_v2.0_m6w3nHW_FuwLOkd (copy).docx
+++ b/test-templates/ghost-templates/Web_-_EN_2025_-_v2.0_m6w3nHW_FuwLOkd (copy).docx
@@ -282,7 +282,6 @@
                                 <w:szCs w:val="36"/>
                               </w:rPr>
                             </w:pPr>
-                            <w:bookmarkStart w:id="0" w:name="_Hlk61448097"/>
                             <w:r>
                               <w:rPr>
                                 <w:rFonts w:cs="Arial" w:ascii="Arial" w:hAnsi="Arial"/>
@@ -294,21 +293,7 @@
                                 <w:sz w:val="36"/>
                                 <w:szCs w:val="36"/>
                               </w:rPr>
-                              <w:t>T</w:t>
-                            </w:r>
-                            <w:bookmarkEnd w:id="0"/>
-                            <w:r>
-                              <w:rPr>
-                                <w:rFonts w:cs="Arial" w:ascii="Arial" w:hAnsi="Arial"/>
-                                <w:b/>
-                                <w:bCs/>
-                                <w:iCs/>
-                                <w:color w:val="000000" w:themeColor="text1"/>
-                                <w:kern w:val="2"/>
-                                <w:sz w:val="36"/>
-                                <w:szCs w:val="36"/>
-                              </w:rPr>
-                              <w:t>itle</w:t>
+                              <w:t>Report Title</w:t>
                             </w:r>
                           </w:p>
                           <w:p>
@@ -521,7 +506,6 @@
                           <w:szCs w:val="36"/>
                         </w:rPr>
                       </w:pPr>
-                      <w:bookmarkStart w:id="1" w:name="_Hlk61448097"/>
                       <w:r>
                         <w:rPr>
                           <w:rFonts w:cs="Arial" w:ascii="Arial" w:hAnsi="Arial"/>
@@ -533,21 +517,7 @@
                           <w:sz w:val="36"/>
                           <w:szCs w:val="36"/>
                         </w:rPr>
-                        <w:t>T</w:t>
-                      </w:r>
-                      <w:bookmarkEnd w:id="1"/>
-                      <w:r>
-                        <w:rPr>
-                          <w:rFonts w:cs="Arial" w:ascii="Arial" w:hAnsi="Arial"/>
-                          <w:b/>
-                          <w:bCs/>
-                          <w:iCs/>
-                          <w:color w:val="000000" w:themeColor="text1"/>
-                          <w:kern w:val="2"/>
-                          <w:sz w:val="36"/>
-                          <w:szCs w:val="36"/>
-                        </w:rPr>
-                        <w:t>itle</w:t>
+                        <w:t>Report Title</w:t>
                       </w:r>
                     </w:p>
                     <w:p>
@@ -732,7 +702,7 @@
           <w:highlight w:val="yellow"/>
         </w:rPr>
       </w:pPr>
-      <w:bookmarkStart w:id="2" w:name="_Hlk4073143"/>
+      <w:bookmarkStart w:id="0" w:name="_Hlk4073143"/>
       <w:r>
         <w:rPr>
           <w:rFonts w:cs="Arial"/>
@@ -745,7 +715,7 @@
           <w:b/>
           <w:bCs/>
         </w:rPr>
-        <w:t xml:space="preserve"> </w:t>
+        <w:t xml:space="preserve">client shortname </w:t>
       </w:r>
       <w:r>
         <w:rPr>
@@ -787,14 +757,14 @@
           <w:rFonts w:cs="Arial"/>
         </w:rPr>
       </w:pPr>
-      <w:bookmarkStart w:id="3" w:name="_Hlk4073143"/>
+      <w:bookmarkStart w:id="1" w:name="_Hlk4073143"/>
       <w:r>
         <w:rPr>
           <w:rFonts w:cs="Arial"/>
         </w:rPr>
         <w:t>The understanding expressed in this document is confined to the conclusions that we specifically formulate in it. If any of these facts, assumptions and representations do not fully correspond to reality or are incomplete, it is imperative that we should be informed immediately of this circumstance, since the incompleteness, inaccuracy or inaccuracy of these facts may have a significant influence on the conclusions we reached.</w:t>
       </w:r>
-      <w:bookmarkEnd w:id="3"/>
+      <w:bookmarkEnd w:id="1"/>
     </w:p>
     <w:p>
       <w:pPr>
@@ -1112,10 +1082,13 @@
             </w:pPr>
             <w:r>
               <w:rPr>
-                <w:rFonts w:eastAsia="Calibri"/>
+                <w:rFonts w:eastAsia="Calibri" w:cs="Arial"/>
+                <w:color w:val="000000" w:themeColor="text1"/>
                 <w:kern w:val="0"/>
+                <w:szCs w:val="20"/>
                 <w:lang w:eastAsia="en-US" w:bidi="ar-SA"/>
               </w:rPr>
+              <w:t>team name</w:t>
             </w:r>
           </w:p>
         </w:tc>
@@ -1142,10 +1115,14 @@
             </w:pPr>
             <w:r>
               <w:rPr>
-                <w:rFonts w:eastAsia="Calibri"/>
+                <w:rFonts w:eastAsia="Calibri" w:cs="Arial"/>
+                <w:color w:val="000000" w:themeColor="text1"/>
                 <w:kern w:val="0"/>
+                <w:szCs w:val="20"/>
+                <w:highlight w:val="yellow"/>
                 <w:lang w:eastAsia="en-US" w:bidi="ar-SA"/>
               </w:rPr>
+              <w:t>report date</w:t>
             </w:r>
           </w:p>
         </w:tc>
@@ -3893,14 +3870,14 @@
         </w:numPr>
         <w:rPr/>
       </w:pPr>
-      <w:bookmarkStart w:id="4" w:name="_Toc506221976"/>
-      <w:bookmarkStart w:id="5" w:name="_Toc112244581"/>
-      <w:bookmarkEnd w:id="4"/>
+      <w:bookmarkStart w:id="2" w:name="_Toc506221976"/>
+      <w:bookmarkStart w:id="3" w:name="_Toc112244581"/>
+      <w:bookmarkEnd w:id="2"/>
       <w:r>
         <w:rPr/>
         <w:t>Executive Summary</w:t>
       </w:r>
-      <w:bookmarkEnd w:id="5"/>
+      <w:bookmarkEnd w:id="3"/>
     </w:p>
     <w:p>
       <w:pPr>
@@ -3926,41 +3903,43 @@
           <w:szCs w:val="36"/>
         </w:rPr>
       </w:pPr>
-      <w:bookmarkStart w:id="6" w:name="_Toc506221976"/>
-      <w:bookmarkStart w:id="7" w:name="_Toc101276846"/>
-      <w:bookmarkStart w:id="8" w:name="_Toc287276843"/>
-      <w:bookmarkStart w:id="9" w:name="_Toc236475722"/>
-      <w:bookmarkStart w:id="10" w:name="_Toc240083419"/>
-      <w:bookmarkStart w:id="11" w:name="_Toc240083153"/>
-      <w:bookmarkStart w:id="12" w:name="_Toc238894582"/>
-      <w:bookmarkStart w:id="13" w:name="_Toc236475064"/>
-      <w:bookmarkStart w:id="14" w:name="_Toc218154657"/>
-      <w:bookmarkStart w:id="15" w:name="_Toc168315957"/>
-      <w:bookmarkStart w:id="16" w:name="_Ref153256142"/>
-      <w:bookmarkStart w:id="17" w:name="_Hlk109400175"/>
-      <w:bookmarkStart w:id="18" w:name="_Toc101276847"/>
-      <w:bookmarkStart w:id="19" w:name="_Toc61879135"/>
-      <w:bookmarkStart w:id="20" w:name="_Toc112244582"/>
-      <w:bookmarkStart w:id="21" w:name="_Toc61879134"/>
-      <w:bookmarkStart w:id="22" w:name="_Toc171854752"/>
-      <w:bookmarkStart w:id="23" w:name="_Ref153255981"/>
-      <w:bookmarkStart w:id="24" w:name="_Toc95709837"/>
-      <w:bookmarkStart w:id="25" w:name="_Toc95210796"/>
-      <w:bookmarkStart w:id="26" w:name="_Toc95210793"/>
-      <w:bookmarkStart w:id="27" w:name="_Toc287276846"/>
-      <w:bookmarkStart w:id="28" w:name="_Toc240083422"/>
-      <w:bookmarkStart w:id="29" w:name="_Toc240083156"/>
-      <w:bookmarkStart w:id="30" w:name="_Toc238894585"/>
-      <w:bookmarkStart w:id="31" w:name="_Toc236475067"/>
-      <w:bookmarkStart w:id="32" w:name="_Toc218154660"/>
-      <w:bookmarkStart w:id="33" w:name="_Toc168315960"/>
-      <w:bookmarkStart w:id="34" w:name="_Toc328859474"/>
-      <w:bookmarkStart w:id="35" w:name="_Toc307368810"/>
-      <w:bookmarkStart w:id="36" w:name="_Toc236475725"/>
-      <w:bookmarkEnd w:id="6"/>
-      <w:bookmarkEnd w:id="18"/>
-      <w:bookmarkEnd w:id="19"/>
+      <w:bookmarkStart w:id="4" w:name="_Toc506221976"/>
+      <w:bookmarkStart w:id="5" w:name="_Toc101276846"/>
+      <w:bookmarkStart w:id="6" w:name="_Toc287276843"/>
+      <w:bookmarkStart w:id="7" w:name="_Toc236475722"/>
+      <w:bookmarkStart w:id="8" w:name="_Toc240083419"/>
+      <w:bookmarkStart w:id="9" w:name="_Toc240083153"/>
+      <w:bookmarkStart w:id="10" w:name="_Toc238894582"/>
+      <w:bookmarkStart w:id="11" w:name="_Toc236475064"/>
+      <w:bookmarkStart w:id="12" w:name="_Toc218154657"/>
+      <w:bookmarkStart w:id="13" w:name="_Toc168315957"/>
+      <w:bookmarkStart w:id="14" w:name="_Ref153256142"/>
+      <w:bookmarkStart w:id="15" w:name="_Hlk109400175"/>
+      <w:bookmarkStart w:id="16" w:name="_Toc101276847"/>
+      <w:bookmarkStart w:id="17" w:name="_Toc61879135"/>
+      <w:bookmarkStart w:id="18" w:name="_Toc112244582"/>
+      <w:bookmarkStart w:id="19" w:name="_Toc61879134"/>
+      <w:bookmarkStart w:id="20" w:name="_Toc171854752"/>
+      <w:bookmarkStart w:id="21" w:name="_Ref153255981"/>
+      <w:bookmarkStart w:id="22" w:name="_Toc95709837"/>
+      <w:bookmarkStart w:id="23" w:name="_Toc95210796"/>
+      <w:bookmarkStart w:id="24" w:name="_Toc95210793"/>
+      <w:bookmarkStart w:id="25" w:name="_Toc287276846"/>
+      <w:bookmarkStart w:id="26" w:name="_Toc240083422"/>
+      <w:bookmarkStart w:id="27" w:name="_Toc240083156"/>
+      <w:bookmarkStart w:id="28" w:name="_Toc238894585"/>
+      <w:bookmarkStart w:id="29" w:name="_Toc236475067"/>
+      <w:bookmarkStart w:id="30" w:name="_Toc218154660"/>
+      <w:bookmarkStart w:id="31" w:name="_Toc168315960"/>
+      <w:bookmarkStart w:id="32" w:name="_Toc328859474"/>
+      <w:bookmarkStart w:id="33" w:name="_Toc307368810"/>
+      <w:bookmarkStart w:id="34" w:name="_Toc236475725"/>
+      <w:bookmarkEnd w:id="4"/>
+      <w:bookmarkEnd w:id="16"/>
+      <w:bookmarkEnd w:id="17"/>
+      <w:bookmarkEnd w:id="20"/>
       <w:bookmarkEnd w:id="22"/>
+      <w:bookmarkEnd w:id="23"/>
       <w:bookmarkEnd w:id="24"/>
       <w:bookmarkEnd w:id="25"/>
       <w:bookmarkEnd w:id="26"/>
@@ -3969,10 +3948,8 @@
       <w:bookmarkEnd w:id="29"/>
       <w:bookmarkEnd w:id="30"/>
       <w:bookmarkEnd w:id="31"/>
-      <w:bookmarkEnd w:id="32"/>
       <w:bookmarkEnd w:id="33"/>
-      <w:bookmarkEnd w:id="35"/>
-      <w:bookmarkEnd w:id="36"/>
+      <w:bookmarkEnd w:id="34"/>
       <w:r>
         <w:rPr>
           <w:rFonts w:eastAsia="" w:eastAsiaTheme="majorEastAsia"/>
@@ -3983,9 +3960,9 @@
         </w:rPr>
         <w:t>Introduction</w:t>
       </w:r>
-      <w:bookmarkEnd w:id="7"/>
-      <w:bookmarkEnd w:id="20"/>
-      <w:bookmarkEnd w:id="21"/>
+      <w:bookmarkEnd w:id="5"/>
+      <w:bookmarkEnd w:id="18"/>
+      <w:bookmarkEnd w:id="19"/>
     </w:p>
     <w:p>
       <w:pPr>
@@ -3994,7 +3971,19 @@
       </w:pPr>
       <w:r>
         <w:rPr/>
-        <w:t>Due to its business activity,  has an ongoing concern about information security in several of its diverse multilateral subjects. Inherently, the inclusion of the security strands – Confidentiality, Integrity and Availability – is part of the current processes and workflows. However, and due to the constant necessity to increase the access to information, workforce mobility, interplay with other entities and technological evolution, the infrastructures and information systems are in constant evolution, challenging the way security is implemented. The main challenge being, enhancing security considering the technological needs that support the business operations.</w:t>
+        <w:t xml:space="preserve">Due to its business activity, </w:t>
+      </w:r>
+      <w:r>
+        <w:rPr>
+          <w:rFonts w:cs="Arial"/>
+          <w:b/>
+          <w:bCs/>
+        </w:rPr>
+        <w:t>client shortname</w:t>
+      </w:r>
+      <w:r>
+        <w:rPr/>
+        <w:t xml:space="preserve"> has an ongoing concern about information security in several of its diverse multilateral subjects. Inherently, the inclusion of the security strands – Confidentiality, Integrity and Availability – is part of the current processes and workflows. However, and due to the constant necessity to increase the access to information, workforce mobility, interplay with other entities and technological evolution, the infrastructures and information systems are in constant evolution, challenging the way security is implemented. The main challenge being, enhancing security considering the technological needs that support the business operations.</w:t>
       </w:r>
     </w:p>
     <w:p>
@@ -4005,6 +3994,14 @@
       <w:r>
         <w:rPr/>
         <w:t xml:space="preserve">This report aims to evaluate the organization’s websites security levels, providing a general and widespread view regarding Confidentiality, Integrity and Availability of the information in </w:t>
+      </w:r>
+      <w:r>
+        <w:rPr>
+          <w:rFonts w:cs="Arial"/>
+          <w:b/>
+          <w:bCs/>
+        </w:rPr>
+        <w:t>client shortname</w:t>
       </w:r>
       <w:r>
         <w:rPr>
@@ -4053,11 +4050,11 @@
           <w:szCs w:val="36"/>
         </w:rPr>
       </w:pPr>
-      <w:bookmarkStart w:id="37" w:name="_Toc101276847"/>
-      <w:bookmarkStart w:id="38" w:name="_Toc61879135"/>
-      <w:bookmarkStart w:id="39" w:name="_Toc112244583"/>
-      <w:bookmarkEnd w:id="37"/>
-      <w:bookmarkEnd w:id="38"/>
+      <w:bookmarkStart w:id="35" w:name="_Toc101276847"/>
+      <w:bookmarkStart w:id="36" w:name="_Toc61879135"/>
+      <w:bookmarkStart w:id="37" w:name="_Toc112244583"/>
+      <w:bookmarkEnd w:id="35"/>
+      <w:bookmarkEnd w:id="36"/>
       <w:r>
         <w:rPr>
           <w:rFonts w:eastAsia="" w:eastAsiaTheme="majorEastAsia"/>
@@ -4068,7 +4065,7 @@
         </w:rPr>
         <w:t>Scope</w:t>
       </w:r>
-      <w:bookmarkEnd w:id="39"/>
+      <w:bookmarkEnd w:id="37"/>
     </w:p>
     <w:p>
       <w:pPr>
@@ -4077,7 +4074,19 @@
       </w:pPr>
       <w:r>
         <w:rPr/>
-        <w:t xml:space="preserve">The scope for this audit was ’s exposed websites on the Internet. The full list of addresses and URLs included in scope are shown in Chapter </w:t>
+        <w:t xml:space="preserve">The scope for this audit was </w:t>
+      </w:r>
+      <w:r>
+        <w:rPr>
+          <w:rFonts w:cs="Arial"/>
+          <w:b/>
+          <w:bCs/>
+        </w:rPr>
+        <w:t>client shortname</w:t>
+      </w:r>
+      <w:r>
+        <w:rPr/>
+        <w:t xml:space="preserve">’s exposed websites on the Internet. The full list of addresses and URLs included in scope are shown in Chapter </w:t>
       </w:r>
       <w:r>
         <w:rPr>
@@ -4102,10 +4111,22 @@
         <w:pStyle w:val="Normal"/>
         <w:rPr/>
       </w:pPr>
-      <w:bookmarkStart w:id="40" w:name="_Hlk109394679"/>
+      <w:bookmarkStart w:id="38" w:name="_Hlk109394679"/>
       <w:r>
         <w:rPr/>
-        <w:t xml:space="preserve">The infrastructure used by the auditor during the tests comprised of a windows and kali linux machines and  provided two test accounts for the penetration test exercises. </w:t>
+        <w:t xml:space="preserve">The infrastructure used by the auditor during the tests comprised of a windows and kali linux machines and </w:t>
+      </w:r>
+      <w:r>
+        <w:rPr>
+          <w:rFonts w:cs="Arial"/>
+          <w:b/>
+          <w:bCs/>
+        </w:rPr>
+        <w:t>client shortname</w:t>
+      </w:r>
+      <w:r>
+        <w:rPr/>
+        <w:t xml:space="preserve"> provided two test accounts for the penetration test exercises. </w:t>
       </w:r>
       <w:r>
         <w:rPr>
@@ -4117,7 +4138,7 @@
         <w:rPr/>
         <w:t xml:space="preserve"> </w:t>
       </w:r>
-      <w:bookmarkEnd w:id="40"/>
+      <w:bookmarkEnd w:id="38"/>
     </w:p>
     <w:p>
       <w:pPr>
@@ -4134,7 +4155,7 @@
           <w:bCs/>
           <w:highlight w:val="yellow"/>
         </w:rPr>
-        <w:t xml:space="preserve"> and </w:t>
+        <w:t>project start date and project end date</w:t>
       </w:r>
       <w:r>
         <w:rPr>
@@ -4186,7 +4207,7 @@
           <w:szCs w:val="36"/>
         </w:rPr>
       </w:pPr>
-      <w:bookmarkStart w:id="41" w:name="_Toc112244584"/>
+      <w:bookmarkStart w:id="39" w:name="_Toc112244584"/>
       <w:r>
         <w:rPr>
           <w:rFonts w:eastAsia="" w:eastAsiaTheme="majorEastAsia"/>
@@ -4197,7 +4218,7 @@
         </w:rPr>
         <w:t>Audit Results</w:t>
       </w:r>
-      <w:bookmarkEnd w:id="41"/>
+      <w:bookmarkEnd w:id="39"/>
     </w:p>
     <w:p>
       <w:pPr>
@@ -4213,6 +4234,14 @@
       <w:r>
         <w:rPr/>
         <w:t xml:space="preserve"> by </w:t>
+      </w:r>
+      <w:r>
+        <w:rPr>
+          <w:rFonts w:cs="Arial"/>
+          <w:b/>
+          <w:bCs/>
+        </w:rPr>
+        <w:t>client shortname</w:t>
       </w:r>
       <w:r>
         <w:rPr>
@@ -4519,6 +4548,13 @@
       </w:r>
       <w:r>
         <w:rPr>
+          <w:b/>
+          <w:bCs/>
+        </w:rPr>
+        <w:t>{{ totals.findings }}</w:t>
+      </w:r>
+      <w:r>
+        <w:rPr>
           <w:rFonts w:cs="" w:cstheme="minorBidi"/>
           <w:b/>
           <w:bCs/>
@@ -4539,7 +4575,7 @@
         </w:rPr>
         <w:t xml:space="preserve">. </w:t>
       </w:r>
-      <w:bookmarkEnd w:id="17"/>
+      <w:bookmarkEnd w:id="15"/>
     </w:p>
     <w:tbl>
       <w:tblPr>
@@ -4705,6 +4741,7 @@
                 <w:kern w:val="0"/>
                 <w:lang w:eastAsia="en-US" w:bidi="ar-SA"/>
               </w:rPr>
+              <w:t>start of findings</w:t>
             </w:r>
           </w:p>
         </w:tc>
@@ -4740,9 +4777,12 @@
             <w:r>
               <w:rPr>
                 <w:rFonts w:eastAsia="Calibri"/>
+                <w:b/>
+                <w:bCs/>
                 <w:kern w:val="0"/>
                 <w:lang w:eastAsia="en-US" w:bidi="ar-SA"/>
               </w:rPr>
+              <w:t>vuln index</w:t>
             </w:r>
           </w:p>
         </w:tc>
@@ -4776,6 +4816,7 @@
                 <w:kern w:val="0"/>
                 <w:lang w:eastAsia="en-US" w:bidi="ar-SA"/>
               </w:rPr>
+              <w:t>finding title</w:t>
             </w:r>
           </w:p>
         </w:tc>
@@ -4806,9 +4847,12 @@
             <w:r>
               <w:rPr>
                 <w:rFonts w:eastAsia="Calibri"/>
+                <w:b/>
+                <w:bCs/>
                 <w:kern w:val="0"/>
-                <w:lang w:eastAsia="en-US" w:bidi="ar-SA"/>
-              </w:rPr>
+                <w:lang w:val="en-GB" w:eastAsia="en-US" w:bidi="ar-SA"/>
+              </w:rPr>
+              <w:t>finding severity</w:t>
             </w:r>
           </w:p>
         </w:tc>
@@ -4849,6 +4893,7 @@
                 <w:kern w:val="0"/>
                 <w:lang w:eastAsia="en-US" w:bidi="ar-SA"/>
               </w:rPr>
+              <w:t>end of findings</w:t>
             </w:r>
           </w:p>
         </w:tc>
@@ -4873,12 +4918,12 @@
         <w:ind w:left="567" w:hanging="576"/>
         <w:rPr/>
       </w:pPr>
-      <w:bookmarkStart w:id="42" w:name="_Toc112244585"/>
+      <w:bookmarkStart w:id="40" w:name="_Toc112244585"/>
       <w:r>
         <w:rPr/>
         <w:t>Recommended Initiatives</w:t>
       </w:r>
-      <w:bookmarkEnd w:id="42"/>
+      <w:bookmarkEnd w:id="40"/>
     </w:p>
     <w:p>
       <w:pPr>
@@ -4888,6 +4933,14 @@
       <w:r>
         <w:rPr/>
         <w:t xml:space="preserve">Following the execution of this audit, the project team leaves a summary of recommended initiatives for </w:t>
+      </w:r>
+      <w:r>
+        <w:rPr>
+          <w:rFonts w:cs="Arial"/>
+          <w:b/>
+          <w:bCs/>
+        </w:rPr>
+        <w:t>client shortname</w:t>
       </w:r>
       <w:r>
         <w:rPr>
@@ -4898,6 +4951,14 @@
       <w:r>
         <w:rPr/>
         <w:t xml:space="preserve">to mitigate and prevent the main risks detected in this report. These initiatives should be framed with the strategic information security plan that </w:t>
+      </w:r>
+      <w:r>
+        <w:rPr>
+          <w:rFonts w:cs="Arial"/>
+          <w:b/>
+          <w:bCs/>
+        </w:rPr>
+        <w:t>client shortname</w:t>
       </w:r>
       <w:r>
         <w:rPr>
@@ -5026,8 +5087,8 @@
           <w:highlight w:val="yellow"/>
         </w:rPr>
       </w:pPr>
-      <w:bookmarkStart w:id="43" w:name="_Hlk107232314"/>
-      <w:bookmarkEnd w:id="43"/>
+      <w:bookmarkStart w:id="41" w:name="_Hlk107232314"/>
+      <w:bookmarkEnd w:id="41"/>
       <w:r>
         <w:rPr>
           <w:highlight w:val="yellow"/>
@@ -5042,10 +5103,12 @@
         </w:rPr>
         <w:t>V0</w:t>
       </w:r>
-      <w:bookmarkStart w:id="44" w:name="_Toc22896616"/>
-      <w:bookmarkStart w:id="45" w:name="_Toc503530134"/>
-      <w:bookmarkStart w:id="46" w:name="_Toc506221988"/>
-      <w:bookmarkStart w:id="47" w:name="_Hlk38554395"/>
+      <w:bookmarkStart w:id="42" w:name="_Toc22896616"/>
+      <w:bookmarkStart w:id="43" w:name="_Toc503530134"/>
+      <w:bookmarkStart w:id="44" w:name="_Toc506221988"/>
+      <w:bookmarkStart w:id="45" w:name="_Hlk38554395"/>
+      <w:bookmarkEnd w:id="6"/>
+      <w:bookmarkEnd w:id="7"/>
       <w:bookmarkEnd w:id="8"/>
       <w:bookmarkEnd w:id="9"/>
       <w:bookmarkEnd w:id="10"/>
@@ -5053,10 +5116,8 @@
       <w:bookmarkEnd w:id="12"/>
       <w:bookmarkEnd w:id="13"/>
       <w:bookmarkEnd w:id="14"/>
-      <w:bookmarkEnd w:id="15"/>
-      <w:bookmarkEnd w:id="16"/>
-      <w:bookmarkEnd w:id="23"/>
-      <w:bookmarkEnd w:id="34"/>
+      <w:bookmarkEnd w:id="21"/>
+      <w:bookmarkEnd w:id="32"/>
       <w:r>
         <w:rPr>
           <w:b/>
@@ -5090,22 +5151,22 @@
         </w:numPr>
         <w:rPr/>
       </w:pPr>
-      <w:bookmarkStart w:id="48" w:name="_Toc518050436"/>
-      <w:bookmarkStart w:id="49" w:name="_Toc101276850"/>
-      <w:bookmarkStart w:id="50" w:name="_Toc4081033"/>
-      <w:bookmarkStart w:id="51" w:name="_Toc61879138"/>
-      <w:bookmarkStart w:id="52" w:name="_Toc27061089"/>
-      <w:bookmarkStart w:id="53" w:name="_Toc112244586"/>
+      <w:bookmarkStart w:id="46" w:name="_Toc518050436"/>
+      <w:bookmarkStart w:id="47" w:name="_Toc101276850"/>
+      <w:bookmarkStart w:id="48" w:name="_Toc4081033"/>
+      <w:bookmarkStart w:id="49" w:name="_Toc61879138"/>
+      <w:bookmarkStart w:id="50" w:name="_Toc27061089"/>
+      <w:bookmarkStart w:id="51" w:name="_Toc112244586"/>
       <w:r>
         <w:rPr/>
         <w:t>Methodology</w:t>
       </w:r>
+      <w:bookmarkEnd w:id="46"/>
+      <w:bookmarkEnd w:id="47"/>
       <w:bookmarkEnd w:id="48"/>
       <w:bookmarkEnd w:id="49"/>
       <w:bookmarkEnd w:id="50"/>
       <w:bookmarkEnd w:id="51"/>
-      <w:bookmarkEnd w:id="52"/>
-      <w:bookmarkEnd w:id="53"/>
     </w:p>
     <w:p>
       <w:pPr>
@@ -5117,20 +5178,20 @@
         <w:ind w:left="567" w:hanging="576"/>
         <w:rPr/>
       </w:pPr>
-      <w:bookmarkStart w:id="54" w:name="_Toc27061090"/>
-      <w:bookmarkStart w:id="55" w:name="_Toc112244587"/>
-      <w:bookmarkStart w:id="56" w:name="_Toc101276851"/>
-      <w:bookmarkStart w:id="57" w:name="_Toc4081034"/>
-      <w:bookmarkStart w:id="58" w:name="_Toc61879139"/>
+      <w:bookmarkStart w:id="52" w:name="_Toc27061090"/>
+      <w:bookmarkStart w:id="53" w:name="_Toc112244587"/>
+      <w:bookmarkStart w:id="54" w:name="_Toc101276851"/>
+      <w:bookmarkStart w:id="55" w:name="_Toc4081034"/>
+      <w:bookmarkStart w:id="56" w:name="_Toc61879139"/>
       <w:r>
         <w:rPr/>
         <w:t>Criteria</w:t>
       </w:r>
+      <w:bookmarkEnd w:id="52"/>
+      <w:bookmarkEnd w:id="53"/>
       <w:bookmarkEnd w:id="54"/>
       <w:bookmarkEnd w:id="55"/>
       <w:bookmarkEnd w:id="56"/>
-      <w:bookmarkEnd w:id="57"/>
-      <w:bookmarkEnd w:id="58"/>
     </w:p>
     <w:p>
       <w:pPr>
@@ -5757,7 +5818,18 @@
             </w:pPr>
             <w:r>
               <w:rPr/>
-              <w:t>The audited systems were identified as making part of  infrastructure.</w:t>
+              <w:t xml:space="preserve">The audited systems were identified as making part of </w:t>
+            </w:r>
+            <w:r>
+              <w:rPr>
+                <w:b/>
+                <w:bCs/>
+              </w:rPr>
+              <w:t>client shortname</w:t>
+            </w:r>
+            <w:r>
+              <w:rPr/>
+              <w:t xml:space="preserve"> infrastructure.</w:t>
             </w:r>
           </w:p>
         </w:tc>
@@ -5885,7 +5957,7 @@
                 <w:b/>
                 <w:bCs/>
               </w:rPr>
-              <w:t xml:space="preserve"> </w:t>
+              <w:t xml:space="preserve">client shortname </w:t>
             </w:r>
             <w:r>
               <w:rPr/>
@@ -6210,20 +6282,20 @@
         <w:ind w:left="567" w:hanging="576"/>
         <w:rPr/>
       </w:pPr>
-      <w:bookmarkStart w:id="59" w:name="_Toc4081035"/>
-      <w:bookmarkStart w:id="60" w:name="_Toc27061091"/>
-      <w:bookmarkStart w:id="61" w:name="_Toc61879140"/>
-      <w:bookmarkStart w:id="62" w:name="_Toc101276852"/>
-      <w:bookmarkStart w:id="63" w:name="_Toc112244588"/>
+      <w:bookmarkStart w:id="57" w:name="_Toc4081035"/>
+      <w:bookmarkStart w:id="58" w:name="_Toc27061091"/>
+      <w:bookmarkStart w:id="59" w:name="_Toc61879140"/>
+      <w:bookmarkStart w:id="60" w:name="_Toc101276852"/>
+      <w:bookmarkStart w:id="61" w:name="_Toc112244588"/>
       <w:r>
         <w:rPr/>
         <w:t>Testing Workflow</w:t>
       </w:r>
+      <w:bookmarkEnd w:id="57"/>
+      <w:bookmarkEnd w:id="58"/>
       <w:bookmarkEnd w:id="59"/>
       <w:bookmarkEnd w:id="60"/>
       <w:bookmarkEnd w:id="61"/>
-      <w:bookmarkEnd w:id="62"/>
-      <w:bookmarkEnd w:id="63"/>
     </w:p>
     <w:p>
       <w:pPr>
@@ -6917,7 +6989,7 @@
           <w:szCs w:val="36"/>
         </w:rPr>
       </w:pPr>
-      <w:bookmarkStart w:id="64" w:name="_Toc112244589"/>
+      <w:bookmarkStart w:id="62" w:name="_Toc112244589"/>
       <w:r>
         <w:rPr>
           <w:rFonts w:eastAsia="" w:eastAsiaTheme="majorEastAsia"/>
@@ -6928,7 +7000,7 @@
         </w:rPr>
         <w:t>Vulnerability Classification</w:t>
       </w:r>
-      <w:bookmarkEnd w:id="64"/>
+      <w:bookmarkEnd w:id="62"/>
     </w:p>
     <w:p>
       <w:pPr>
@@ -8480,12 +8552,12 @@
           <w:szCs w:val="36"/>
         </w:rPr>
       </w:pPr>
-      <w:bookmarkStart w:id="65" w:name="_Toc112244590"/>
-      <w:bookmarkStart w:id="66" w:name="_Toc27061093"/>
-      <w:bookmarkStart w:id="67" w:name="_Toc101276853"/>
-      <w:bookmarkStart w:id="68" w:name="_Toc4081037"/>
-      <w:bookmarkStart w:id="69" w:name="_Toc503530136"/>
-      <w:bookmarkStart w:id="70" w:name="_Toc61879141"/>
+      <w:bookmarkStart w:id="63" w:name="_Toc112244590"/>
+      <w:bookmarkStart w:id="64" w:name="_Toc27061093"/>
+      <w:bookmarkStart w:id="65" w:name="_Toc101276853"/>
+      <w:bookmarkStart w:id="66" w:name="_Toc4081037"/>
+      <w:bookmarkStart w:id="67" w:name="_Toc503530136"/>
+      <w:bookmarkStart w:id="68" w:name="_Toc61879141"/>
       <w:r>
         <w:rPr>
           <w:rFonts w:eastAsia="" w:eastAsiaTheme="majorEastAsia"/>
@@ -8496,12 +8568,12 @@
         </w:rPr>
         <w:t>Deontology</w:t>
       </w:r>
+      <w:bookmarkEnd w:id="63"/>
+      <w:bookmarkEnd w:id="64"/>
       <w:bookmarkEnd w:id="65"/>
       <w:bookmarkEnd w:id="66"/>
       <w:bookmarkEnd w:id="67"/>
       <w:bookmarkEnd w:id="68"/>
-      <w:bookmarkEnd w:id="69"/>
-      <w:bookmarkEnd w:id="70"/>
     </w:p>
     <w:p>
       <w:pPr>
@@ -8590,12 +8662,12 @@
           <w:szCs w:val="36"/>
         </w:rPr>
       </w:pPr>
-      <w:bookmarkStart w:id="71" w:name="_Toc503530137"/>
-      <w:bookmarkStart w:id="72" w:name="_Toc4081038"/>
-      <w:bookmarkStart w:id="73" w:name="_Toc27061094"/>
-      <w:bookmarkStart w:id="74" w:name="_Toc101276854"/>
-      <w:bookmarkStart w:id="75" w:name="_Toc112244591"/>
-      <w:bookmarkStart w:id="76" w:name="_Toc61879142"/>
+      <w:bookmarkStart w:id="69" w:name="_Toc503530137"/>
+      <w:bookmarkStart w:id="70" w:name="_Toc4081038"/>
+      <w:bookmarkStart w:id="71" w:name="_Toc27061094"/>
+      <w:bookmarkStart w:id="72" w:name="_Toc101276854"/>
+      <w:bookmarkStart w:id="73" w:name="_Toc112244591"/>
+      <w:bookmarkStart w:id="74" w:name="_Toc61879142"/>
       <w:r>
         <w:rPr>
           <w:rFonts w:eastAsia="" w:eastAsiaTheme="majorEastAsia"/>
@@ -8606,12 +8678,12 @@
         </w:rPr>
         <w:t>Privacy and Information Protection</w:t>
       </w:r>
+      <w:bookmarkEnd w:id="69"/>
+      <w:bookmarkEnd w:id="70"/>
       <w:bookmarkEnd w:id="71"/>
       <w:bookmarkEnd w:id="72"/>
       <w:bookmarkEnd w:id="73"/>
       <w:bookmarkEnd w:id="74"/>
-      <w:bookmarkEnd w:id="75"/>
-      <w:bookmarkEnd w:id="76"/>
     </w:p>
     <w:p>
       <w:pPr>
@@ -8670,21 +8742,23 @@
         </w:numPr>
         <w:rPr/>
       </w:pPr>
-      <w:bookmarkStart w:id="77" w:name="_Toc171854752"/>
-      <w:bookmarkStart w:id="78" w:name="_Toc95709837"/>
-      <w:bookmarkStart w:id="79" w:name="_Toc95210796"/>
-      <w:bookmarkStart w:id="80" w:name="_Toc95210793"/>
-      <w:bookmarkStart w:id="81" w:name="_Toc287276846"/>
-      <w:bookmarkStart w:id="82" w:name="_Toc240083422"/>
-      <w:bookmarkStart w:id="83" w:name="_Toc240083156"/>
-      <w:bookmarkStart w:id="84" w:name="_Toc238894585"/>
-      <w:bookmarkStart w:id="85" w:name="_Toc236475067"/>
-      <w:bookmarkStart w:id="86" w:name="_Toc218154660"/>
-      <w:bookmarkStart w:id="87" w:name="_Toc168315960"/>
-      <w:bookmarkStart w:id="88" w:name="_Toc307368810"/>
-      <w:bookmarkStart w:id="89" w:name="_Toc236475725"/>
-      <w:bookmarkStart w:id="90" w:name="_Hlk107232314"/>
-      <w:bookmarkStart w:id="91" w:name="_Toc112244592"/>
+      <w:bookmarkStart w:id="75" w:name="_Toc171854752"/>
+      <w:bookmarkStart w:id="76" w:name="_Toc95709837"/>
+      <w:bookmarkStart w:id="77" w:name="_Toc95210796"/>
+      <w:bookmarkStart w:id="78" w:name="_Toc95210793"/>
+      <w:bookmarkStart w:id="79" w:name="_Toc287276846"/>
+      <w:bookmarkStart w:id="80" w:name="_Toc240083422"/>
+      <w:bookmarkStart w:id="81" w:name="_Toc240083156"/>
+      <w:bookmarkStart w:id="82" w:name="_Toc238894585"/>
+      <w:bookmarkStart w:id="83" w:name="_Toc236475067"/>
+      <w:bookmarkStart w:id="84" w:name="_Toc218154660"/>
+      <w:bookmarkStart w:id="85" w:name="_Toc168315960"/>
+      <w:bookmarkStart w:id="86" w:name="_Toc307368810"/>
+      <w:bookmarkStart w:id="87" w:name="_Toc236475725"/>
+      <w:bookmarkStart w:id="88" w:name="_Hlk107232314"/>
+      <w:bookmarkStart w:id="89" w:name="_Toc112244592"/>
+      <w:bookmarkEnd w:id="75"/>
+      <w:bookmarkEnd w:id="76"/>
       <w:bookmarkEnd w:id="77"/>
       <w:bookmarkEnd w:id="78"/>
       <w:bookmarkEnd w:id="79"/>
@@ -8697,29 +8771,27 @@
       <w:bookmarkEnd w:id="86"/>
       <w:bookmarkEnd w:id="87"/>
       <w:bookmarkEnd w:id="88"/>
-      <w:bookmarkEnd w:id="89"/>
-      <w:bookmarkEnd w:id="90"/>
+      <w:bookmarkEnd w:id="42"/>
+      <w:bookmarkEnd w:id="43"/>
       <w:bookmarkEnd w:id="44"/>
       <w:bookmarkEnd w:id="45"/>
-      <w:bookmarkEnd w:id="46"/>
-      <w:bookmarkEnd w:id="47"/>
       <w:r>
         <w:rPr/>
         <w:t>Vulnerability Details</w:t>
       </w:r>
-      <w:bookmarkEnd w:id="91"/>
+      <w:bookmarkEnd w:id="89"/>
     </w:p>
     <w:p>
       <w:pPr>
         <w:pStyle w:val="Normal"/>
         <w:rPr/>
       </w:pPr>
-      <w:bookmarkStart w:id="92" w:name="_Hlk38555249"/>
+      <w:bookmarkStart w:id="90" w:name="_Hlk38555249"/>
       <w:r>
         <w:rPr/>
         <w:t>The following figure represents the structure used to describe the identified vulnerabilities. Its format complies with the methodology and the concepts presented in Chapter 2.</w:t>
       </w:r>
-      <w:bookmarkEnd w:id="92"/>
+      <w:bookmarkEnd w:id="90"/>
     </w:p>
     <w:p>
       <w:pPr>
@@ -9379,7 +9451,7 @@
         <mc:AlternateContent>
           <mc:Choice Requires="wps">
             <w:drawing>
-              <wp:anchor behindDoc="0" distT="38100" distB="22225" distL="76200" distR="57150" simplePos="0" locked="0" layoutInCell="0" allowOverlap="1" relativeHeight="141" wp14:anchorId="6925A7AB">
+              <wp:anchor behindDoc="0" distT="38100" distB="22225" distL="76200" distR="57150" simplePos="0" locked="0" layoutInCell="0" allowOverlap="1" relativeHeight="143" wp14:anchorId="6925A7AB">
                 <wp:simplePos x="0" y="0"/>
                 <wp:positionH relativeFrom="column">
                   <wp:posOffset>1061720</wp:posOffset>
@@ -9604,7 +9676,7 @@
         <mc:AlternateContent>
           <mc:Choice Requires="wps">
             <w:drawing>
-              <wp:anchor behindDoc="0" distT="0" distB="27940" distL="0" distR="23495" simplePos="0" locked="0" layoutInCell="0" allowOverlap="1" relativeHeight="139" wp14:anchorId="61AED7F2">
+              <wp:anchor behindDoc="0" distT="0" distB="27940" distL="0" distR="23495" simplePos="0" locked="0" layoutInCell="0" allowOverlap="1" relativeHeight="141" wp14:anchorId="61AED7F2">
                 <wp:simplePos x="0" y="0"/>
                 <wp:positionH relativeFrom="column">
                   <wp:posOffset>676910</wp:posOffset>
@@ -9775,7 +9847,7 @@
           <w:b/>
           <w:bCs/>
         </w:rPr>
-        <w:t xml:space="preserve"> </w:t>
+        <w:t xml:space="preserve">client shortname </w:t>
       </w:r>
       <w:r>
         <w:rPr>
@@ -9809,14 +9881,14 @@
         <w:ind w:left="576" w:hanging="576"/>
         <w:rPr/>
       </w:pPr>
-      <w:bookmarkStart w:id="93" w:name="_Toc112244593"/>
-      <w:bookmarkStart w:id="94" w:name="_Toc108025316"/>
+      <w:bookmarkStart w:id="91" w:name="_Toc112244593"/>
+      <w:bookmarkStart w:id="92" w:name="_Toc108025316"/>
       <w:r>
         <w:rPr/>
         <w:t>Identified Vulnerabilities</w:t>
       </w:r>
-      <w:bookmarkEnd w:id="93"/>
-      <w:bookmarkEnd w:id="94"/>
+      <w:bookmarkEnd w:id="91"/>
+      <w:bookmarkEnd w:id="92"/>
     </w:p>
     <w:p>
       <w:pPr>
@@ -9839,6 +9911,7 @@
       </w:pPr>
       <w:r>
         <w:rPr/>
+        <w:t>for finding in findings</w:t>
       </w:r>
     </w:p>
     <w:p>
@@ -9866,17 +9939,24 @@
           <w:color w:val="FFFFFF" w:themeColor="background1"/>
         </w:rPr>
       </w:pPr>
-      <w:bookmarkStart w:id="95" w:name="_Toc112244594"/>
-      <w:bookmarkStart w:id="96" w:name="_Toc109050279"/>
+      <w:bookmarkStart w:id="93" w:name="_Toc112244594"/>
+      <w:bookmarkStart w:id="94" w:name="_Toc109050279"/>
       <w:r>
         <w:rPr>
           <w:color w:val="FFFFFF" w:themeColor="background1"/>
           <w:lang w:eastAsia="pt-PT"/>
         </w:rPr>
-        <w:t>{{ finding.title }}</w:t>
+        <w:t>t</w:t>
       </w:r>
-      <w:bookmarkEnd w:id="95"/>
-      <w:bookmarkEnd w:id="96"/>
+      <w:bookmarkEnd w:id="93"/>
+      <w:bookmarkEnd w:id="94"/>
+      <w:r>
+        <w:rPr>
+          <w:color w:val="FFFFFF" w:themeColor="background1"/>
+          <w:lang w:eastAsia="pt-PT"/>
+        </w:rPr>
+        <w:t>itle of finding</w:t>
+      </w:r>
     </w:p>
     <w:tbl>
       <w:tblPr>
@@ -9928,10 +10008,14 @@
             </w:pPr>
             <w:r>
               <w:rPr>
+                <w:rFonts w:cs="Calibri"/>
+                <w:b/>
                 <w:bCs/>
+                <w:color w:val="auto"/>
                 <w:kern w:val="0"/>
-                <w:lang w:bidi="ar-SA"/>
-              </w:rPr>
+                <w:lang w:val="en-GB" w:eastAsia="pt-PT" w:bidi="ar-SA"/>
+              </w:rPr>
+              <w:t>vuln index</w:t>
             </w:r>
           </w:p>
         </w:tc>
@@ -9960,9 +10044,14 @@
             </w:pPr>
             <w:r>
               <w:rPr>
+                <w:rFonts w:cs="Calibri"/>
+                <w:b/>
+                <w:bCs w:val="false"/>
+                <w:color w:val="auto"/>
                 <w:kern w:val="0"/>
-                <w:lang w:bidi="ar-SA"/>
-              </w:rPr>
+                <w:lang w:eastAsia="pt-PT" w:bidi="ar-SA"/>
+              </w:rPr>
+              <w:t>title of finding</w:t>
             </w:r>
           </w:p>
         </w:tc>
@@ -10033,9 +10122,14 @@
             </w:pPr>
             <w:r>
               <w:rPr>
+                <w:b w:val="false"/>
+                <w:bCs/>
+                <w:color w:val="auto"/>
                 <w:kern w:val="0"/>
-                <w:lang w:eastAsia="en-US" w:bidi="ar-SA"/>
-              </w:rPr>
+                <w:u w:val="single"/>
+                <w:lang w:val="en-GB" w:eastAsia="en-US" w:bidi="ar-SA"/>
+              </w:rPr>
+              <w:t>finding cvss link</w:t>
             </w:r>
           </w:p>
         </w:tc>
@@ -10133,8 +10227,11 @@
             <w:r>
               <w:rPr>
                 <w:kern w:val="0"/>
-                <w:lang w:eastAsia="en-US" w:bidi="ar-SA"/>
-              </w:rPr>
+                <w:sz w:val="18"/>
+                <w:szCs w:val="18"/>
+                <w:lang w:val="en-GB" w:eastAsia="en-US" w:bidi="ar-SA"/>
+              </w:rPr>
+              <w:t>finding severity</w:t>
             </w:r>
           </w:p>
         </w:tc>
@@ -10198,18 +10295,19 @@
               <w:spacing w:before="0" w:after="0"/>
               <w:cnfStyle w:val="000000000000" w:firstRow="0" w:lastRow="0" w:firstColumn="0" w:lastColumn="0" w:oddVBand="0" w:evenVBand="0" w:oddHBand="0" w:evenHBand="0" w:firstRowFirstColumn="0" w:firstRowLastColumn="0" w:lastRowFirstColumn="0" w:lastRowLastColumn="0"/>
               <w:rPr>
-                <w:b w:val="false"/>
+                <w:kern w:val="0"/>
+                <w:lang w:eastAsia="en-US" w:bidi="ar-SA"/>
+              </w:rPr>
+            </w:pPr>
+            <w:r>
+              <w:rPr>
                 <w:b w:val="false"/>
                 <w:bCs/>
                 <w:color w:val="auto"/>
-                <w:lang w:val="en-GB"/>
-              </w:rPr>
-            </w:pPr>
-            <w:r>
-              <w:rPr>
                 <w:kern w:val="0"/>
-                <w:lang w:eastAsia="en-US" w:bidi="ar-SA"/>
-              </w:rPr>
+                <w:lang w:val="en-GB" w:eastAsia="en-US" w:bidi="ar-SA"/>
+              </w:rPr>
+              <w:t>finding classification</w:t>
             </w:r>
           </w:p>
         </w:tc>
@@ -10301,18 +10399,136 @@
               <w:spacing w:before="0" w:after="0"/>
               <w:cnfStyle w:val="000000000000" w:firstRow="0" w:lastRow="0" w:firstColumn="0" w:lastColumn="0" w:oddVBand="0" w:evenVBand="0" w:oddHBand="0" w:evenHBand="0" w:firstRowFirstColumn="0" w:firstRowLastColumn="0" w:lastRowFirstColumn="0" w:lastRowLastColumn="0"/>
               <w:rPr>
-                <w:b w:val="false"/>
+                <w:kern w:val="0"/>
+                <w:lang w:eastAsia="en-US" w:bidi="ar-SA"/>
+              </w:rPr>
+            </w:pPr>
+            <w:r>
+              <mc:AlternateContent>
+                <mc:Choice Requires="wps">
+                  <w:drawing>
+                    <wp:anchor behindDoc="0" distT="0" distB="0" distL="0" distR="0" simplePos="0" locked="0" layoutInCell="0" allowOverlap="1" relativeHeight="139" wp14:anchorId="699E6AFE">
+                      <wp:simplePos x="0" y="0"/>
+                      <wp:positionH relativeFrom="column">
+                        <wp:posOffset>2862580</wp:posOffset>
+                      </wp:positionH>
+                      <wp:positionV relativeFrom="paragraph">
+                        <wp:posOffset>-429895</wp:posOffset>
+                      </wp:positionV>
+                      <wp:extent cx="2514600" cy="520700"/>
+                      <wp:effectExtent l="0" t="0" r="0" b="0"/>
+                      <wp:wrapNone/>
+                      <wp:docPr id="37" name="Text Box 2"/>
+                      <a:graphic xmlns:a="http://schemas.openxmlformats.org/drawingml/2006/main">
+                        <a:graphicData uri="http://schemas.microsoft.com/office/word/2010/wordprocessingShape">
+                          <wps:wsp>
+                            <wps:cNvSpPr/>
+                            <wps:spPr>
+                              <a:xfrm>
+                                <a:off x="0" y="0"/>
+                                <a:ext cx="2514600" cy="520560"/>
+                              </a:xfrm>
+                              <a:prstGeom prst="rect">
+                                <a:avLst/>
+                              </a:prstGeom>
+                              <a:noFill/>
+                              <a:ln w="9525">
+                                <a:noFill/>
+                              </a:ln>
+                            </wps:spPr>
+                            <wps:style>
+                              <a:lnRef idx="0"/>
+                              <a:fillRef idx="0"/>
+                              <a:effectRef idx="0"/>
+                              <a:fontRef idx="minor"/>
+                            </wps:style>
+                            <wps:txbx>
+                              <w:txbxContent>
+                                <w:p>
+                                  <w:pPr>
+                                    <w:pStyle w:val="FrameContents"/>
+                                    <w:widowControl w:val="false"/>
+                                    <w:spacing w:before="0" w:after="200"/>
+                                    <w:jc w:val="center"/>
+                                    <w:rPr>
+                                      <w:b/>
+                                      <w:b/>
+                                      <w:bCs/>
+                                      <w:sz w:val="42"/>
+                                      <w:szCs w:val="42"/>
+                                    </w:rPr>
+                                  </w:pPr>
+                                  <w:r>
+                                    <w:rPr>
+                                      <w:b/>
+                                      <w:bCs/>
+                                      <w:sz w:val="42"/>
+                                      <w:szCs w:val="42"/>
+                                      <w:lang w:val="en-GB"/>
+                                    </w:rPr>
+                                    <w:t>finding cvss score</w:t>
+                                  </w:r>
+                                </w:p>
+                              </w:txbxContent>
+                            </wps:txbx>
+                            <wps:bodyPr anchor="t">
+                              <a:noAutofit/>
+                            </wps:bodyPr>
+                          </wps:wsp>
+                        </a:graphicData>
+                      </a:graphic>
+                    </wp:anchor>
+                  </w:drawing>
+                </mc:Choice>
+                <mc:Fallback>
+                  <w:pict>
+                    <v:rect id="shape_0" ID="Text Box 2" path="m0,0l-2147483645,0l-2147483645,-2147483646l0,-2147483646xe" stroked="f" o:allowincell="f" style="position:absolute;margin-left:225.4pt;margin-top:-33.85pt;width:197.95pt;height:40.95pt;mso-wrap-style:square;v-text-anchor:top" wp14:anchorId="699E6AFE">
+                      <v:fill o:detectmouseclick="t" on="false"/>
+                      <v:stroke color="#3465a4" weight="9360" joinstyle="miter" endcap="flat"/>
+                      <v:textbox>
+                        <w:txbxContent>
+                          <w:p>
+                            <w:pPr>
+                              <w:pStyle w:val="FrameContents"/>
+                              <w:widowControl w:val="false"/>
+                              <w:spacing w:before="0" w:after="200"/>
+                              <w:jc w:val="center"/>
+                              <w:rPr>
+                                <w:b/>
+                                <w:b/>
+                                <w:bCs/>
+                                <w:sz w:val="42"/>
+                                <w:szCs w:val="42"/>
+                              </w:rPr>
+                            </w:pPr>
+                            <w:r>
+                              <w:rPr>
+                                <w:b/>
+                                <w:bCs/>
+                                <w:sz w:val="42"/>
+                                <w:szCs w:val="42"/>
+                                <w:lang w:val="en-GB"/>
+                              </w:rPr>
+                              <w:t>finding cvss score</w:t>
+                            </w:r>
+                          </w:p>
+                        </w:txbxContent>
+                      </v:textbox>
+                      <w10:wrap type="none"/>
+                    </v:rect>
+                  </w:pict>
+                </mc:Fallback>
+              </mc:AlternateContent>
+            </w:r>
+            <w:r>
+              <w:rPr>
                 <w:b w:val="false"/>
                 <w:bCs/>
                 <w:color w:val="auto"/>
-                <w:lang w:val="en-GB"/>
-              </w:rPr>
-            </w:pPr>
-            <w:r>
-              <w:rPr>
                 <w:kern w:val="0"/>
-                <w:lang w:eastAsia="en-US" w:bidi="ar-SA"/>
-              </w:rPr>
+                <w:lang w:val="en-GB" w:eastAsia="en-US" w:bidi="ar-SA"/>
+              </w:rPr>
+              <w:t>finding affected entities</w:t>
             </w:r>
           </w:p>
         </w:tc>
@@ -10378,7 +10594,10 @@
         </w:rPr>
       </w:pPr>
       <w:r>
-        <w:rPr/>
+        <w:rPr>
+          <w:lang w:val="en-GB"/>
+        </w:rPr>
+        <w:t>finding description</w:t>
       </w:r>
     </w:p>
     <w:p>
@@ -10416,7 +10635,10 @@
         </w:rPr>
       </w:pPr>
       <w:r>
-        <w:rPr/>
+        <w:rPr>
+          <w:lang w:val="en-GB"/>
+        </w:rPr>
+        <w:t>finding impact</w:t>
       </w:r>
     </w:p>
     <w:p>
@@ -10454,7 +10676,10 @@
         </w:rPr>
       </w:pPr>
       <w:r>
-        <w:rPr/>
+        <w:rPr>
+          <w:lang w:val="en-GB"/>
+        </w:rPr>
+        <w:t>finding replications steps</w:t>
       </w:r>
     </w:p>
     <w:p>
@@ -10493,7 +10718,10 @@
         </w:rPr>
       </w:pPr>
       <w:r>
-        <w:rPr/>
+        <w:rPr>
+          <w:lang w:val="en-GB"/>
+        </w:rPr>
+        <w:t>finding recommendations</w:t>
       </w:r>
     </w:p>
     <w:p>
@@ -10514,12 +10742,13 @@
     <w:p>
       <w:pPr>
         <w:pStyle w:val="Normal"/>
+        <w:rPr/>
+      </w:pPr>
+      <w:r>
         <w:rPr>
           <w:lang w:val="en-GB"/>
         </w:rPr>
-      </w:pPr>
-      <w:r>
-        <w:rPr/>
+        <w:t>end for</w:t>
       </w:r>
       <w:r>
         <w:br w:type="page"/>
@@ -10534,12 +10763,12 @@
         </w:numPr>
         <w:rPr/>
       </w:pPr>
-      <w:bookmarkStart w:id="97" w:name="_Toc112244595"/>
+      <w:bookmarkStart w:id="95" w:name="_Toc112244595"/>
       <w:r>
         <w:rPr/>
         <w:t>Annexes</w:t>
       </w:r>
-      <w:bookmarkEnd w:id="97"/>
+      <w:bookmarkEnd w:id="95"/>
       <w:r>
         <w:rPr/>
         <w:t xml:space="preserve"> </w:t>
@@ -10555,18 +10784,18 @@
         <w:ind w:left="936" w:hanging="576"/>
         <w:rPr/>
       </w:pPr>
-      <w:bookmarkStart w:id="98" w:name="_Toc112244596"/>
-      <w:bookmarkStart w:id="99" w:name="_Toc62213622"/>
+      <w:bookmarkStart w:id="96" w:name="_Toc112244596"/>
+      <w:bookmarkStart w:id="97" w:name="_Toc62213622"/>
       <w:r>
         <w:rPr/>
         <w:t xml:space="preserve">Annex 1 – </w:t>
       </w:r>
-      <w:bookmarkEnd w:id="99"/>
+      <w:bookmarkEnd w:id="97"/>
       <w:r>
         <w:rPr/>
         <w:t>Scope</w:t>
       </w:r>
-      <w:bookmarkEnd w:id="98"/>
+      <w:bookmarkEnd w:id="96"/>
       <w:r>
         <w:rPr/>
         <w:t xml:space="preserve"> </w:t>
@@ -10683,7 +10912,10 @@
               </w:rPr>
             </w:pPr>
             <w:r>
-              <w:rPr/>
+              <w:rPr>
+                <w:lang w:val="en-GB"/>
+              </w:rPr>
+              <w:t>for item in scope</w:t>
             </w:r>
           </w:p>
         </w:tc>
@@ -10716,7 +10948,12 @@
               </w:rPr>
             </w:pPr>
             <w:r>
-              <w:rPr/>
+              <w:rPr>
+                <w:rFonts w:eastAsia="Times New Roman" w:cs="Calibri"/>
+                <w:color w:val="000000"/>
+                <w:lang w:val="en-GB" w:eastAsia="pt-PT"/>
+              </w:rPr>
+              <w:t>item scope</w:t>
             </w:r>
           </w:p>
         </w:tc>
@@ -10750,6 +10987,7 @@
             </w:pPr>
             <w:r>
               <w:rPr/>
+              <w:t>end of findings</w:t>
             </w:r>
           </w:p>
         </w:tc>
@@ -10816,9 +11054,9 @@
       <w:r>
         <w:rPr/>
       </w:r>
-      <w:bookmarkStart w:id="100" w:name="_Toc185065640"/>
-      <w:bookmarkStart w:id="101" w:name="_Toc185065640"/>
-      <w:bookmarkEnd w:id="101"/>
+      <w:bookmarkStart w:id="98" w:name="_Toc185065640"/>
+      <w:bookmarkStart w:id="99" w:name="_Toc185065640"/>
+      <w:bookmarkEnd w:id="99"/>
     </w:p>
     <w:p>
       <w:pPr>
@@ -11717,9 +11955,16 @@
             </w:pPr>
             <w:r>
               <w:rPr>
+                <w:rFonts w:eastAsia="Times New Roman"/>
+                <w:b/>
+                <w:bCs/>
+                <w:color w:val="FF0000"/>
                 <w:kern w:val="0"/>
-                <w:lang w:bidi="ar-SA"/>
-              </w:rPr>
+                <w:szCs w:val="20"/>
+                <w:highlight w:val="yellow"/>
+                <w:lang w:eastAsia="pt-PT" w:bidi="ar-SA"/>
+              </w:rPr>
+              <w:t>team name</w:t>
             </w:r>
           </w:p>
           <w:p>
@@ -11804,6 +12049,17 @@
               <w:t>Mobile: +351 93 993 9023</w:t>
               <w:br/>
               <w:t xml:space="preserve">Email: </w:t>
+            </w:r>
+            <w:r>
+              <w:rPr>
+                <w:rFonts w:eastAsia="Times New Roman"/>
+                <w:kern w:val="0"/>
+                <w:sz w:val="18"/>
+                <w:szCs w:val="17"/>
+                <w:highlight w:val="yellow"/>
+                <w:lang w:eastAsia="en-US" w:bidi="ar-SA"/>
+              </w:rPr>
+              <w:t>team email</w:t>
             </w:r>
           </w:p>
           <w:p>
@@ -12250,7 +12506,7 @@
                 <wp:extent cx="640080" cy="10699750"/>
                 <wp:effectExtent l="40005" t="17145" r="40005" b="62865"/>
                 <wp:wrapNone/>
-                <wp:docPr id="48" name="Rectangle 6"/>
+                <wp:docPr id="50" name="Rectangle 6"/>
                 <a:graphic xmlns:a="http://schemas.openxmlformats.org/drawingml/2006/main">
                   <a:graphicData uri="http://schemas.microsoft.com/office/word/2010/wordprocessingShape">
                     <wps:wsp>
@@ -12366,7 +12622,7 @@
             <wp:extent cx="5909310" cy="737235"/>
             <wp:effectExtent l="0" t="0" r="0" b="0"/>
             <wp:wrapNone/>
-            <wp:docPr id="50" name="Picture 235" descr=""/>
+            <wp:docPr id="52" name="Picture 235" descr=""/>
             <wp:cNvGraphicFramePr>
               <a:graphicFrameLocks xmlns:a="http://schemas.openxmlformats.org/drawingml/2006/main" noChangeAspect="1"/>
             </wp:cNvGraphicFramePr>
@@ -12374,7 +12630,7 @@
               <a:graphicData uri="http://schemas.openxmlformats.org/drawingml/2006/picture">
                 <pic:pic xmlns:pic="http://schemas.openxmlformats.org/drawingml/2006/picture">
                   <pic:nvPicPr>
-                    <pic:cNvPr id="50" name="Picture 235" descr=""/>
+                    <pic:cNvPr id="52" name="Picture 235" descr=""/>
                     <pic:cNvPicPr>
                       <a:picLocks noChangeAspect="1" noChangeArrowheads="1"/>
                     </pic:cNvPicPr>
@@ -12438,7 +12694,7 @@
         <w:docPartGallery w:val="Page Numbers (Bottom of Page)"/>
         <w:docPartUnique w:val="true"/>
       </w:docPartObj>
-      <w:id w:val="1246105619"/>
+      <w:id w:val="1822642015"/>
     </w:sdtPr>
     <w:sdtContent>
       <w:p>
@@ -12463,7 +12719,7 @@
                   <wp:extent cx="1094105" cy="206375"/>
                   <wp:effectExtent l="0" t="0" r="0" b="0"/>
                   <wp:wrapNone/>
-                  <wp:docPr id="38" name="Picture 3"/>
+                  <wp:docPr id="40" name="Picture 3"/>
                   <a:graphic xmlns:a="http://schemas.openxmlformats.org/drawingml/2006/main">
                     <a:graphicData uri="http://schemas.openxmlformats.org/drawingml/2006/picture">
                       <pic:pic xmlns:pic="http://schemas.openxmlformats.org/drawingml/2006/picture">
@@ -12528,7 +12784,7 @@
                 <wp:anchor behindDoc="1" distT="0" distB="0" distL="0" distR="0" simplePos="0" locked="0" layoutInCell="0" allowOverlap="1" relativeHeight="80" wp14:anchorId="3D4A6978">
                   <wp:simplePos x="0" y="0"/>
                   <wp:positionH relativeFrom="margin">
-                    <wp:posOffset>-640080</wp:posOffset>
+                    <wp:posOffset>-760095</wp:posOffset>
                   </wp:positionH>
                   <wp:positionV relativeFrom="paragraph">
                     <wp:posOffset>-450850</wp:posOffset>
@@ -12536,7 +12792,7 @@
                   <wp:extent cx="6751320" cy="445135"/>
                   <wp:effectExtent l="0" t="0" r="0" b="0"/>
                   <wp:wrapNone/>
-                  <wp:docPr id="39" name="Text Box 2"/>
+                  <wp:docPr id="41" name="Text Box 2"/>
                   <a:graphic xmlns:a="http://schemas.openxmlformats.org/drawingml/2006/main">
                     <a:graphicData uri="http://schemas.microsoft.com/office/word/2010/wordprocessingShape">
                       <wps:wsp>
@@ -12622,7 +12878,7 @@
                                   <w:sz w:val="16"/>
                                   <w:szCs w:val="14"/>
                                 </w:rPr>
-                                <w:t xml:space="preserve"> </w:t>
+                                <w:t xml:space="preserve">client shortname </w:t>
                               </w:r>
                               <w:r>
                                 <w:rPr>
@@ -12653,21 +12909,38 @@
                                   <w:sz w:val="16"/>
                                   <w:szCs w:val="14"/>
                                 </w:rPr>
-                                <w:t xml:space="preserve"> and ‘</w:t>
+                                <w:t xml:space="preserve"> and </w:t>
+                              </w:r>
+                              <w:r>
+                                <w:rPr>
+                                  <w:b/>
+                                  <w:sz w:val="16"/>
+                                  <w:szCs w:val="14"/>
+                                </w:rPr>
+                                <w:t>client shortname</w:t>
+                              </w:r>
+                              <w:r>
+                                <w:rPr>
+                                  <w:bCs/>
+                                  <w:sz w:val="16"/>
+                                  <w:szCs w:val="14"/>
+                                </w:rPr>
+                                <w:t>’s</w:t>
+                              </w:r>
+                              <w:r>
+                                <w:rPr>
+                                  <w:b/>
+                                  <w:sz w:val="16"/>
+                                  <w:szCs w:val="14"/>
+                                </w:rPr>
+                                <w:t xml:space="preserve"> </w:t>
                               </w:r>
                               <w:r>
                                 <w:rPr>
                                   <w:sz w:val="16"/>
                                   <w:szCs w:val="14"/>
                                 </w:rPr>
-                                <w:t>s ex</w:t>
-                              </w:r>
-                              <w:r>
-                                <w:rPr>
-                                  <w:sz w:val="16"/>
-                                  <w:szCs w:val="14"/>
-                                </w:rPr>
-                                <w:t>plicit consent.</w:t>
+                                <w:t>explicit consent.</w:t>
                               </w:r>
                             </w:p>
                             <w:p>
@@ -12709,7 +12982,7 @@
             </mc:Choice>
             <mc:Fallback>
               <w:pict>
-                <v:rect id="shape_0" ID="Text Box 2" path="m0,0l-2147483645,0l-2147483645,-2147483646l0,-2147483646xe" fillcolor="white" stroked="f" o:allowincell="f" style="position:absolute;margin-left:-50.4pt;margin-top:-35.5pt;width:531.55pt;height:35pt;mso-wrap-style:square;v-text-anchor:top;mso-position-horizontal-relative:margin" wp14:anchorId="3D4A6978">
+                <v:rect id="shape_0" ID="Text Box 2" path="m0,0l-2147483645,0l-2147483645,-2147483646l0,-2147483646xe" fillcolor="white" stroked="f" o:allowincell="f" style="position:absolute;margin-left:-59.85pt;margin-top:-35.5pt;width:531.55pt;height:35pt;mso-wrap-style:square;v-text-anchor:top;mso-position-horizontal-relative:margin" wp14:anchorId="3D4A6978">
                   <v:fill o:detectmouseclick="t" type="solid" color2="black"/>
                   <v:stroke color="#3465a4" weight="9360" joinstyle="miter" endcap="flat"/>
                   <v:textbox>
@@ -12772,7 +13045,7 @@
                             <w:sz w:val="16"/>
                             <w:szCs w:val="14"/>
                           </w:rPr>
-                          <w:t xml:space="preserve"> </w:t>
+                          <w:t xml:space="preserve">client shortname </w:t>
                         </w:r>
                         <w:r>
                           <w:rPr>
@@ -12803,21 +13076,38 @@
                             <w:sz w:val="16"/>
                             <w:szCs w:val="14"/>
                           </w:rPr>
-                          <w:t xml:space="preserve"> and ‘</w:t>
+                          <w:t xml:space="preserve"> and </w:t>
+                        </w:r>
+                        <w:r>
+                          <w:rPr>
+                            <w:b/>
+                            <w:sz w:val="16"/>
+                            <w:szCs w:val="14"/>
+                          </w:rPr>
+                          <w:t>client shortname</w:t>
+                        </w:r>
+                        <w:r>
+                          <w:rPr>
+                            <w:bCs/>
+                            <w:sz w:val="16"/>
+                            <w:szCs w:val="14"/>
+                          </w:rPr>
+                          <w:t>’s</w:t>
+                        </w:r>
+                        <w:r>
+                          <w:rPr>
+                            <w:b/>
+                            <w:sz w:val="16"/>
+                            <w:szCs w:val="14"/>
+                          </w:rPr>
+                          <w:t xml:space="preserve"> </w:t>
                         </w:r>
                         <w:r>
                           <w:rPr>
                             <w:sz w:val="16"/>
                             <w:szCs w:val="14"/>
                           </w:rPr>
-                          <w:t>s ex</w:t>
-                        </w:r>
-                        <w:r>
-                          <w:rPr>
-                            <w:sz w:val="16"/>
-                            <w:szCs w:val="14"/>
-                          </w:rPr>
-                          <w:t>plicit consent.</w:t>
+                          <w:t>explicit consent.</w:t>
                         </w:r>
                       </w:p>
                       <w:p>
@@ -12867,7 +13157,7 @@
                   <wp:extent cx="2590800" cy="265430"/>
                   <wp:effectExtent l="0" t="0" r="0" b="0"/>
                   <wp:wrapNone/>
-                  <wp:docPr id="41" name="Rectangle 6"/>
+                  <wp:docPr id="43" name="Rectangle 6"/>
                   <a:graphic xmlns:a="http://schemas.openxmlformats.org/drawingml/2006/main">
                     <a:graphicData uri="http://schemas.microsoft.com/office/word/2010/wordprocessingShape">
                       <wps:wsp>
@@ -13020,7 +13310,7 @@
               <wp:lineTo x="-16" y="0"/>
             </wp:wrapPolygon>
           </wp:wrapTight>
-          <wp:docPr id="43" name="Picture 2" descr=""/>
+          <wp:docPr id="45" name="Picture 2" descr=""/>
           <wp:cNvGraphicFramePr>
             <a:graphicFrameLocks xmlns:a="http://schemas.openxmlformats.org/drawingml/2006/main" noChangeAspect="1"/>
           </wp:cNvGraphicFramePr>
@@ -13028,7 +13318,7 @@
             <a:graphicData uri="http://schemas.openxmlformats.org/drawingml/2006/picture">
               <pic:pic xmlns:pic="http://schemas.openxmlformats.org/drawingml/2006/picture">
                 <pic:nvPicPr>
-                  <pic:cNvPr id="43" name="Picture 2" descr=""/>
+                  <pic:cNvPr id="45" name="Picture 2" descr=""/>
                   <pic:cNvPicPr>
                     <a:picLocks noChangeAspect="1" noChangeArrowheads="1"/>
                   </pic:cNvPicPr>
@@ -13064,10 +13354,10 @@
               <wp:positionV relativeFrom="page">
                 <wp:posOffset>10084435</wp:posOffset>
               </wp:positionV>
-              <wp:extent cx="1851660" cy="445770"/>
+              <wp:extent cx="1851660" cy="440690"/>
               <wp:effectExtent l="0" t="0" r="0" b="0"/>
               <wp:wrapTopAndBottom/>
-              <wp:docPr id="44" name="TextBox 3"/>
+              <wp:docPr id="46" name="TextBox 3"/>
               <a:graphic xmlns:a="http://schemas.openxmlformats.org/drawingml/2006/main">
                 <a:graphicData uri="http://schemas.microsoft.com/office/word/2010/wordprocessingShape">
                   <wps:wsp>
@@ -13075,7 +13365,7 @@
                     <wps:spPr>
                       <a:xfrm>
                         <a:off x="0" y="0"/>
-                        <a:ext cx="1851840" cy="445680"/>
+                        <a:ext cx="1851840" cy="440640"/>
                       </a:xfrm>
                       <a:prstGeom prst="rect">
                         <a:avLst/>
@@ -13107,7 +13397,14 @@
                             </w:rPr>
                           </w:pPr>
                           <w:r>
-                            <w:rPr/>
+                            <w:rPr>
+                              <w:rFonts w:cs="Arial" w:ascii="Arial" w:hAnsi="Arial"/>
+                              <w:b/>
+                              <w:bCs/>
+                              <w:color w:val="000000" w:themeColor="text1"/>
+                              <w:kern w:val="2"/>
+                            </w:rPr>
+                            <w:t>project codename</w:t>
                           </w:r>
                         </w:p>
                         <w:p>
@@ -13124,7 +13421,15 @@
                             </w:rPr>
                           </w:pPr>
                           <w:r>
-                            <w:rPr/>
+                            <w:rPr>
+                              <w:rFonts w:cs="Arial" w:ascii="Arial" w:hAnsi="Arial"/>
+                              <w:b/>
+                              <w:bCs/>
+                              <w:color w:val="000000" w:themeColor="text1"/>
+                              <w:kern w:val="2"/>
+                              <w:highlight w:val="yellow"/>
+                            </w:rPr>
+                            <w:t>report date</w:t>
                           </w:r>
                         </w:p>
                       </w:txbxContent>
@@ -13140,7 +13445,7 @@
         </mc:Choice>
         <mc:Fallback>
           <w:pict>
-            <v:rect id="shape_0" ID="TextBox 3" path="m0,0l-2147483645,0l-2147483645,-2147483646l0,-2147483646xe" stroked="f" o:allowincell="f" style="position:absolute;margin-left:-23.9pt;margin-top:794.05pt;width:145.75pt;height:35.05pt;mso-wrap-style:square;v-text-anchor:top;mso-position-vertical-relative:page" wp14:anchorId="740AD807">
+            <v:rect id="shape_0" ID="TextBox 3" path="m0,0l-2147483645,0l-2147483645,-2147483646l0,-2147483646xe" stroked="f" o:allowincell="f" style="position:absolute;margin-left:-23.9pt;margin-top:794.05pt;width:145.75pt;height:34.65pt;mso-wrap-style:square;v-text-anchor:top;mso-position-vertical-relative:page" wp14:anchorId="740AD807">
               <v:fill o:detectmouseclick="t" on="false"/>
               <v:stroke color="#3465a4" joinstyle="round" endcap="flat"/>
               <v:textbox>
@@ -13159,7 +13464,14 @@
                       </w:rPr>
                     </w:pPr>
                     <w:r>
-                      <w:rPr/>
+                      <w:rPr>
+                        <w:rFonts w:cs="Arial" w:ascii="Arial" w:hAnsi="Arial"/>
+                        <w:b/>
+                        <w:bCs/>
+                        <w:color w:val="000000" w:themeColor="text1"/>
+                        <w:kern w:val="2"/>
+                      </w:rPr>
+                      <w:t>project codename</w:t>
                     </w:r>
                   </w:p>
                   <w:p>
@@ -13176,7 +13488,15 @@
                       </w:rPr>
                     </w:pPr>
                     <w:r>
-                      <w:rPr/>
+                      <w:rPr>
+                        <w:rFonts w:cs="Arial" w:ascii="Arial" w:hAnsi="Arial"/>
+                        <w:b/>
+                        <w:bCs/>
+                        <w:color w:val="000000" w:themeColor="text1"/>
+                        <w:kern w:val="2"/>
+                        <w:highlight w:val="yellow"/>
+                      </w:rPr>
+                      <w:t>report date</w:t>
                     </w:r>
                   </w:p>
                 </w:txbxContent>
@@ -13200,7 +13520,7 @@
               <wp:extent cx="2265680" cy="266700"/>
               <wp:effectExtent l="0" t="0" r="0" b="0"/>
               <wp:wrapSquare wrapText="bothSides"/>
-              <wp:docPr id="46" name="Text Box 2"/>
+              <wp:docPr id="48" name="Text Box 2"/>
               <a:graphic xmlns:a="http://schemas.openxmlformats.org/drawingml/2006/main">
                 <a:graphicData uri="http://schemas.microsoft.com/office/word/2010/wordprocessingShape">
                   <wps:wsp>
@@ -13365,7 +13685,13 @@
             </w:rPr>
           </w:pPr>
           <w:r>
-            <w:rPr/>
+            <w:rPr>
+              <w:rFonts w:ascii="Univers 45 Light" w:hAnsi="Univers 45 Light"/>
+              <w:b/>
+              <w:sz w:val="16"/>
+              <w:szCs w:val="16"/>
+            </w:rPr>
+            <w:t>client shortname</w:t>
           </w:r>
         </w:p>
       </w:tc>
@@ -13422,7 +13748,13 @@
             </w:rPr>
           </w:pPr>
           <w:r>
-            <w:rPr/>
+            <w:rPr>
+              <w:rFonts w:ascii="Univers 45 Light" w:hAnsi="Univers 45 Light"/>
+              <w:sz w:val="16"/>
+              <w:szCs w:val="16"/>
+              <w:highlight w:val="yellow"/>
+            </w:rPr>
+            <w:t>report date</w:t>
           </w:r>
         </w:p>
       </w:tc>
@@ -13455,7 +13787,7 @@
               <wp:extent cx="10153650" cy="19050"/>
               <wp:effectExtent l="50165" t="29210" r="49530" b="69850"/>
               <wp:wrapNone/>
-              <wp:docPr id="37" name="Straight Connector 5"/>
+              <wp:docPr id="39" name="Straight Connector 5"/>
               <a:graphic xmlns:a="http://schemas.openxmlformats.org/drawingml/2006/main">
                 <a:graphicData uri="http://schemas.microsoft.com/office/word/2010/wordprocessingShape">
                   <wps:wsp>

</xml_diff>